<commit_message>
Ada Koch I (EN): el cuaderno de Ada es «the sketchbook»; el de hule de Klaus sigue siendo «notebook»
Co-Authored-By: Claude Opus 5.5 <noreply@anthropic.com>
Claude-Session: https://claude.ai/code/session_01HymiadRDUPzWBtequ8tm6m
</commit_message>
<xml_diff>
--- a/ada_koch/libro_1/en/The_Lovers_of_the_Spiral.docx
+++ b/ada_koch/libro_1/en/The_Lovers_of_the_Spiral.docx
@@ -554,15 +554,15 @@
         <w:pStyle w:val="FirstParagraph"/>
       </w:pPr>
       <w:r>
-        <w:t xml:space="preserve">In the afternoon, when I’d finished, I did what I always do. I opened the notebook.</w:t>
-      </w:r>
-    </w:p>
-    <w:p>
-      <w:pPr>
-        <w:pStyle w:val="BodyText"/>
-      </w:pPr>
-      <w:r>
-        <w:t xml:space="preserve">In the closet I have a box full of black notebooks, all the same. Twenty-three years of notebooks. Almost all of it is clouds, because I draw the sky the way other women draw flowers. But in the margins, in the corners, in any empty space, there he is.</w:t>
+        <w:t xml:space="preserve">In the afternoon, when I’d finished, I did what I always do. I opened the sketchbook.</w:t>
+      </w:r>
+    </w:p>
+    <w:p>
+      <w:pPr>
+        <w:pStyle w:val="BodyText"/>
+      </w:pPr>
+      <w:r>
+        <w:t xml:space="preserve">In the closet I have a box full of black sketchbooks, all the same. Twenty-three years of sketchbooks. Almost all of it is clouds, because I draw the sky the way other women draw flowers. But in the margins, in the corners, in any empty space, there he is.</w:t>
       </w:r>
     </w:p>
     <w:p>
@@ -725,7 +725,7 @@
         <w:pStyle w:val="BodyText"/>
       </w:pPr>
       <w:r>
-        <w:t xml:space="preserve">I set the phone face down on the table, on top of the notebook, as if I could cover it up.</w:t>
+        <w:t xml:space="preserve">I set the phone face down on the table, on top of the sketchbook, as if I could cover it up.</w:t>
       </w:r>
     </w:p>
     <w:p>
@@ -757,7 +757,7 @@
         <w:pStyle w:val="BodyText"/>
       </w:pPr>
       <w:r>
-        <w:t xml:space="preserve">I tidied the kitchen, which was already tidy. I sorted the notebooks in the box by year. I did all the things a woman does when she doesn’t want to think about something, and that something sits down beside her anyway, patiently, to wait until she’s done.</w:t>
+        <w:t xml:space="preserve">I tidied the kitchen, which was already tidy. I sorted the sketchbooks in the box by year. I did all the things a woman does when she doesn’t want to think about something, and that something sits down beside her anyway, patiently, to wait until she’s done.</w:t>
       </w:r>
     </w:p>
     <w:p>
@@ -789,7 +789,7 @@
         <w:pStyle w:val="BodyText"/>
       </w:pPr>
       <w:r>
-        <w:t xml:space="preserve">And I opened the notebook again.</w:t>
+        <w:t xml:space="preserve">And I opened the sketchbook again.</w:t>
       </w:r>
     </w:p>
     <w:p>
@@ -857,7 +857,7 @@
         <w:pStyle w:val="BodyText"/>
       </w:pPr>
       <w:r>
-        <w:t xml:space="preserve">I hugged the notebook to my chest and rested my head against the back of the couch. I thought I wouldn’t be able to sleep. I thought about the message, about the nine digits, about his way of writing without a greeting, as if one weren’t needed. I thought about everything I’d left there, and everything I’d brought with me without realizing.</w:t>
+        <w:t xml:space="preserve">I hugged the sketchbook to my chest and rested my head against the back of the couch. I thought I wouldn’t be able to sleep. I thought about the message, about the nine digits, about his way of writing without a greeting, as if one weren’t needed. I thought about everything I’d left there, and everything I’d brought with me without realizing.</w:t>
       </w:r>
     </w:p>
     <w:p>
@@ -881,7 +881,7 @@
         <w:pStyle w:val="BodyText"/>
       </w:pPr>
       <w:r>
-        <w:t xml:space="preserve">I woke at three in the morning to a gust of wind that made the windowpanes shake. The lamp was still on. The notebook had slipped into my lap, open to the same page.</w:t>
+        <w:t xml:space="preserve">I woke at three in the morning to a gust of wind that made the windowpanes shake. The lamp was still on. The sketchbook had slipped into my lap, open to the same page.</w:t>
       </w:r>
     </w:p>
     <w:p>
@@ -2416,18 +2416,18 @@
         <w:pStyle w:val="BodyText"/>
       </w:pPr>
       <w:r>
-        <w:t xml:space="preserve">The notebook was peeking out of my pocket. I always carry it with me. She saw it and touched it with her fingertip.</w:t>
-      </w:r>
-    </w:p>
-    <w:p>
-      <w:pPr>
-        <w:pStyle w:val="BodyText"/>
-      </w:pPr>
-      <w:r>
-        <w:t xml:space="preserve">“</w:t>
-      </w:r>
-      <w:r>
-        <w:t xml:space="preserve">And that notebook?</w:t>
+        <w:t xml:space="preserve">The sketchbook was peeking out of my pocket. I always carry it with me. She saw it and touched it with her fingertip.</w:t>
+      </w:r>
+    </w:p>
+    <w:p>
+      <w:pPr>
+        <w:pStyle w:val="BodyText"/>
+      </w:pPr>
+      <w:r>
+        <w:t xml:space="preserve">“</w:t>
+      </w:r>
+      <w:r>
+        <w:t xml:space="preserve">And that sketchbook?</w:t>
       </w:r>
       <w:r>
         <w:t xml:space="preserve">”</w:t>
@@ -2460,7 +2460,7 @@
         <w:pStyle w:val="BodyText"/>
       </w:pPr>
       <w:r>
-        <w:t xml:space="preserve">Only once, in my whole life, had my grandmother seen that drawing. I was twelve and spending the summer in this house. I left the notebook open on the kitchen table and, when I came back from the beach, she was looking at it. She didn’t scold me. She only asked who he was. I told her nobody, that I’d made him up, red as a tomato.</w:t>
+        <w:t xml:space="preserve">Only once, in my whole life, had my grandmother seen that drawing. I was twelve and spending the summer in this house. I left the sketchbook open on the kitchen table and, when I came back from the beach, she was looking at it. She didn’t scold me. She only asked who he was. I told her nobody, that I’d made him up, red as a tomato.</w:t>
       </w:r>
     </w:p>
     <w:p>
@@ -3306,7 +3306,7 @@
         <w:pStyle w:val="BodyText"/>
       </w:pPr>
       <w:r>
-        <w:t xml:space="preserve">At one-thirty I gave up. I pulled the thick sweatshirt on over my pajamas, went down to the kitchen, switched on the small lamp and took out the notebook.</w:t>
+        <w:t xml:space="preserve">At one-thirty I gave up. I pulled the thick sweatshirt on over my pajamas, went down to the kitchen, switched on the small lamp and took out the sketchbook.</w:t>
       </w:r>
     </w:p>
     <w:p>
@@ -3322,7 +3322,7 @@
         <w:pStyle w:val="BodyText"/>
       </w:pPr>
       <w:r>
-        <w:t xml:space="preserve">I opened the notebook to a blank page. Not a corner, not a margin. A whole page, clean, the kind I usually save for the important clouds.</w:t>
+        <w:t xml:space="preserve">I opened the sketchbook to a blank page. Not a corner, not a margin. A whole page, clean, the kind I usually save for the important clouds.</w:t>
       </w:r>
     </w:p>
     <w:p>
@@ -3401,7 +3401,7 @@
         <w:pStyle w:val="BodyText"/>
       </w:pPr>
       <w:r>
-        <w:t xml:space="preserve">From then on I drew him in every notebook. He grew up with me, without my planning it. At eleven I gave him a scar on his left eyebrow, because the boys in adventure books always had one. I thought it was the most romantic thing in the world. At thirteen I erased it, embarrassed, and never gave it back to him.</w:t>
+        <w:t xml:space="preserve">From then on I drew him in every sketchbook. He grew up with me, without my planning it. At eleven I gave him a scar on his left eyebrow, because the boys in adventure books always had one. I thought it was the most romantic thing in the world. At thirteen I erased it, embarrassed, and never gave it back to him.</w:t>
       </w:r>
     </w:p>
     <w:p>
@@ -3433,7 +3433,7 @@
         <w:pStyle w:val="BodyText"/>
       </w:pPr>
       <w:r>
-        <w:t xml:space="preserve">I was twenty and head over heels for a boy in my department who played guitar at parties and wrote me bad poems on napkins. One night, in his student apartment, I showed him my notebooks. The clouds first. And then, with my heart in my mouth, a page where he was, sitting on a dock, looking at the water.</w:t>
+        <w:t xml:space="preserve">I was twenty and head over heels for a boy in my department who played guitar at parties and wrote me bad poems on napkins. One night, in his student apartment, I showed him my sketchbooks. The clouds first. And then, with my heart in my mouth, a page where he was, sitting on a dock, looking at the water.</w:t>
       </w:r>
     </w:p>
     <w:p>
@@ -3473,15 +3473,15 @@
         <w:pStyle w:val="BodyText"/>
       </w:pPr>
       <w:r>
-        <w:t xml:space="preserve">He didn’t mean it badly. I know that. He was a sweet, clumsy boy who didn’t know what he was holding. But I shut the notebook so fast I caught my finger, and I never showed it to him again. Not to him or anyone.</w:t>
-      </w:r>
-    </w:p>
-    <w:p>
-      <w:pPr>
-        <w:pStyle w:val="BodyText"/>
-      </w:pPr>
-      <w:r>
-        <w:t xml:space="preserve">Since then the notebooks have lived in a box at the back of the closet, like love letters you never send.</w:t>
+        <w:t xml:space="preserve">He didn’t mean it badly. I know that. He was a sweet, clumsy boy who didn’t know what he was holding. But I shut the sketchbook so fast I caught my finger, and I never showed it to him again. Not to him or anyone.</w:t>
+      </w:r>
+    </w:p>
+    <w:p>
+      <w:pPr>
+        <w:pStyle w:val="BodyText"/>
+      </w:pPr>
+      <w:r>
+        <w:t xml:space="preserve">Since then the sketchbooks have lived in a box at the back of the closet, like love letters you never send.</w:t>
       </w:r>
     </w:p>
     <w:p>
@@ -3640,7 +3640,7 @@
         <w:pStyle w:val="BodyText"/>
       </w:pPr>
       <w:r>
-        <w:t xml:space="preserve">I closed the notebook. I left both hands on its black covers, as if I were keeping in something that might escape.</w:t>
+        <w:t xml:space="preserve">I closed the sketchbook. I left both hands on its black covers, as if I were keeping in something that might escape.</w:t>
       </w:r>
     </w:p>
     <w:p>
@@ -4336,7 +4336,7 @@
         <w:pStyle w:val="BodyText"/>
       </w:pPr>
       <w:r>
-        <w:t xml:space="preserve">I had the notebook on my knees, closed. I didn’t open it. I was a little embarrassed to open it, after the night before. Like when you’ve sent someone a message that was too honest and the next day you don’t dare look at your phone.</w:t>
+        <w:t xml:space="preserve">I had the sketchbook on my knees, closed. I didn’t open it. I was a little embarrassed to open it, after the night before. Like when you’ve sent someone a message that was too honest and the next day you don’t dare look at your phone.</w:t>
       </w:r>
     </w:p>
     <w:p>
@@ -4624,7 +4624,7 @@
         <w:pStyle w:val="BodyText"/>
       </w:pPr>
       <w:r>
-        <w:t xml:space="preserve">I hugged the notebook to my chest, without opening it, as if it were a teddy bear. Ridiculous. A thirty-two-year-old woman hugging a sketchbook in the middle of a storm.</w:t>
+        <w:t xml:space="preserve">I hugged the sketchbook to my chest, without opening it, as if it were a teddy bear. Ridiculous. A thirty-two-year-old woman hugging a sketchbook in the middle of a storm.</w:t>
       </w:r>
     </w:p>
     <w:p>
@@ -4640,7 +4640,7 @@
         <w:pStyle w:val="BodyText"/>
       </w:pPr>
       <w:r>
-        <w:t xml:space="preserve">I thought, for the first time in a long time, that I was very alone. Not alone the way I liked to be, with the sea and my notebooks and my silence. Truly alone. Alone the way you are in a small boat in the middle of the night.</w:t>
+        <w:t xml:space="preserve">I thought, for the first time in a long time, that I was very alone. Not alone the way I liked to be, with the sea and my sketchbooks and my silence. Truly alone. Alone the way you are in a small boat in the middle of the night.</w:t>
       </w:r>
     </w:p>
     <w:p>
@@ -4981,7 +4981,7 @@
         <w:pStyle w:val="BodyText"/>
       </w:pPr>
       <w:r>
-        <w:t xml:space="preserve">I didn’t breathe. I didn’t move a finger. I stayed on the sofa, the blanket over my legs and the notebook pressed against my chest, listening with my whole body.</w:t>
+        <w:t xml:space="preserve">I didn’t breathe. I didn’t move a finger. I stayed on the sofa, the blanket over my legs and the sketchbook pressed against my chest, listening with my whole body.</w:t>
       </w:r>
     </w:p>
     <w:p>
@@ -5037,7 +5037,7 @@
         <w:pStyle w:val="BodyText"/>
       </w:pPr>
       <w:r>
-        <w:t xml:space="preserve">I leapt to my feet. The blanket fell to the floor. The notebook didn’t. I was gripping it so hard my fingers hurt.</w:t>
+        <w:t xml:space="preserve">I leapt to my feet. The blanket fell to the floor. The sketchbook didn’t. I was gripping it so hard my fingers hurt.</w:t>
       </w:r>
     </w:p>
     <w:p>
@@ -5573,7 +5573,7 @@
         <w:pStyle w:val="BodyText"/>
       </w:pPr>
       <w:r>
-        <w:t xml:space="preserve">I knew it better than my own. I had drawn it a thousand times. Ten thousand. I had drawn it the night before, at three in the morning, on a whole page of a black-covered notebook that at that very moment I was clutching to my chest, so hard my breastbone hurt.</w:t>
+        <w:t xml:space="preserve">I knew it better than my own. I had drawn it a thousand times. Ten thousand. I had drawn it the night before, at three in the morning, on a whole page of a black-covered sketchbook that at that very moment I was clutching to my chest, so hard my breastbone hurt.</w:t>
       </w:r>
     </w:p>
     <w:p>
@@ -6521,7 +6521,7 @@
         <w:pStyle w:val="BodyText"/>
       </w:pPr>
       <w:r>
-        <w:t xml:space="preserve">Or I had. Maybe I had. Maybe in some margin, in some notebook from ten years ago, a pencil dot that slipped out of me. I didn’t know. I still don’t.</w:t>
+        <w:t xml:space="preserve">Or I had. Maybe I had. Maybe in some margin, in some sketchbook from ten years ago, a pencil dot that slipped out of me. I didn’t know. I still don’t.</w:t>
       </w:r>
     </w:p>
     <w:p>
@@ -6778,7 +6778,7 @@
         <w:pStyle w:val="BodyText"/>
       </w:pPr>
       <w:r>
-        <w:t xml:space="preserve">I sat across from him, on the other side of the table, the notebook closed on my knees. And I started asking him questions. Like a scientist. Like a madwoman.</w:t>
+        <w:t xml:space="preserve">I sat across from him, on the other side of the table, the sketchbook closed on my knees. And I started asking him questions. Like a scientist. Like a madwoman.</w:t>
       </w:r>
     </w:p>
     <w:p>
@@ -7302,7 +7302,7 @@
         <w:pStyle w:val="BodyText"/>
       </w:pPr>
       <w:r>
-        <w:t xml:space="preserve">I spent the night sitting on the bed, with the flashlight on and the notebook in my hands. Without opening it. I didn’t dare. I was afraid of what I might find inside. Or of what I might not.</w:t>
+        <w:t xml:space="preserve">I spent the night sitting on the bed, with the flashlight on and the sketchbook in my hands. Without opening it. I didn’t dare. I was afraid of what I might find inside. Or of what I might not.</w:t>
       </w:r>
     </w:p>
     <w:p>
@@ -7933,7 +7933,7 @@
         <w:pStyle w:val="BodyText"/>
       </w:pPr>
       <w:r>
-        <w:t xml:space="preserve">I opened the notebook.</w:t>
+        <w:t xml:space="preserve">I opened the sketchbook.</w:t>
       </w:r>
     </w:p>
     <w:p>
@@ -7973,15 +7973,15 @@
         <w:pStyle w:val="BodyText"/>
       </w:pPr>
       <w:r>
-        <w:t xml:space="preserve">But no. He was still in the notebook. And, if nothing had changed during the night, he was also still in my kitchen.</w:t>
-      </w:r>
-    </w:p>
-    <w:p>
-      <w:pPr>
-        <w:pStyle w:val="BodyText"/>
-      </w:pPr>
-      <w:r>
-        <w:t xml:space="preserve">I sat on the bed for a while, the notebook open on my knees, not daring to move. Outside, the wind had dropped a little. It wasn’t roaring anymore. It moaned, long and tired, like someone who has screamed all night and has no voice left.</w:t>
+        <w:t xml:space="preserve">But no. He was still in the sketchbook. And, if nothing had changed during the night, he was also still in my kitchen.</w:t>
+      </w:r>
+    </w:p>
+    <w:p>
+      <w:pPr>
+        <w:pStyle w:val="BodyText"/>
+      </w:pPr>
+      <w:r>
+        <w:t xml:space="preserve">I sat on the bed for a while, the sketchbook open on my knees, not daring to move. Outside, the wind had dropped a little. It wasn’t roaring anymore. It moaned, long and tired, like someone who has screamed all night and has no voice left.</w:t>
       </w:r>
     </w:p>
     <w:p>
@@ -7997,7 +7997,7 @@
         <w:pStyle w:val="BodyText"/>
       </w:pPr>
       <w:r>
-        <w:t xml:space="preserve">I went out into the hallway barefoot, the notebook pressed against my chest.</w:t>
+        <w:t xml:space="preserve">I went out into the hallway barefoot, the sketchbook pressed against my chest.</w:t>
       </w:r>
     </w:p>
     <w:p>
@@ -8264,7 +8264,7 @@
         <w:pStyle w:val="BodyText"/>
       </w:pPr>
       <w:r>
-        <w:t xml:space="preserve">Then I sat across from him, like the night before. I put the notebook on the table, between us. Closed.</w:t>
+        <w:t xml:space="preserve">Then I sat across from him, like the night before. I put the sketchbook on the table, between us. Closed.</w:t>
       </w:r>
     </w:p>
     <w:p>
@@ -8295,7 +8295,7 @@
         <w:pStyle w:val="FirstParagraph"/>
       </w:pPr>
       <w:r>
-        <w:t xml:space="preserve">I opened the notebook to Tuesday’s page and turned it toward the light. I looked at him. At the drawing. At him.</w:t>
+        <w:t xml:space="preserve">I opened the sketchbook to Tuesday’s page and turned it toward the light. I looked at him. At the drawing. At him.</w:t>
       </w:r>
     </w:p>
     <w:p>
@@ -8379,7 +8379,7 @@
         <w:pStyle w:val="BodyText"/>
       </w:pPr>
       <w:r>
-        <w:t xml:space="preserve">At eleven I had drawn him a scar right there, on his left eyebrow. A thin white line that split it in two. I drew it in every notebook for two years, proud of it. At thirteen it seemed like a little-girl thing and I erased it. I never gave it back to him.</w:t>
+        <w:t xml:space="preserve">At eleven I had drawn him a scar right there, on his left eyebrow. A thin white line that split it in two. I drew it in every sketchbook for two years, proud of it. At thirteen it seemed like a little-girl thing and I erased it. I never gave it back to him.</w:t>
       </w:r>
     </w:p>
     <w:p>
@@ -8435,7 +8435,7 @@
         <w:pStyle w:val="BodyText"/>
       </w:pPr>
       <w:r>
-        <w:t xml:space="preserve">Not the one from the last ten years. Not the one from all the notebooks I keep in the box in the closet. The one from that night. The one I drew a few hours before someone knocked on my door.</w:t>
+        <w:t xml:space="preserve">Not the one from the last ten years. Not the one from all the sketchbooks I keep in the box in the closet. The one from that night. The one I drew a few hours before someone knocked on my door.</w:t>
       </w:r>
     </w:p>
     <w:p>
@@ -8486,7 +8486,7 @@
         <w:pStyle w:val="BodyText"/>
       </w:pPr>
       <w:r>
-        <w:t xml:space="preserve">Twenty-three years of black notebooks. They smelled of old paper, of graphite, of the damp in the closet.</w:t>
+        <w:t xml:space="preserve">Twenty-three years of black sketchbooks. They smelled of old paper, of graphite, of the damp in the closet.</w:t>
       </w:r>
     </w:p>
     <w:p>
@@ -8510,7 +8510,7 @@
         <w:pStyle w:val="BodyText"/>
       </w:pPr>
       <w:r>
-        <w:t xml:space="preserve">Each notebook held a period of my life. I saw it there, with the notebooks open on the table like cards from a deck. The one from the year of college entrance exams, full of nervous clouds and of him studying next to me, with an open book I never finished drawing. The one from Hamburg, the Erasmus winter, with him walking through the snow by the river, his jacket collar turned up, because I was so cold and so lonely that I drew him with me. The one from Madrid, the first year, when everything was lovely, with him almost hidden, tiny, in the corners, as if he were embarrassed to be there.</w:t>
+        <w:t xml:space="preserve">Each sketchbook held a period of my life. I saw it there, with the sketchbooks open on the table like cards from a deck. The one from the year of college entrance exams, full of nervous clouds and of him studying next to me, with an open book I never finished drawing. The one from Hamburg, the Erasmus winter, with him walking through the snow by the river, his jacket collar turned up, because I was so cold and so lonely that I drew him with me. The one from Madrid, the first year, when everything was lovely, with him almost hidden, tiny, in the corners, as if he were embarrassed to be there.</w:t>
       </w:r>
     </w:p>
     <w:p>
@@ -8542,7 +8542,7 @@
         <w:pStyle w:val="BodyText"/>
       </w:pPr>
       <w:r>
-        <w:t xml:space="preserve">He said nothing. But when I looked up, he was looking at me, not at the notebooks. And there was something in his eyes that looked a lot like sorrow.</w:t>
+        <w:t xml:space="preserve">He said nothing. But when I looked up, he was looking at me, not at the sketchbooks. And there was something in his eyes that looked a lot like sorrow.</w:t>
       </w:r>
     </w:p>
     <w:p>
@@ -8574,7 +8574,7 @@
         <w:pStyle w:val="BodyText"/>
       </w:pPr>
       <w:r>
-        <w:t xml:space="preserve">I looked for it. I searched through every notebook, page by page, for more than an hour, while he watched me in silence and the coffee went cold in the cups. I searched the backs, the shoulders, the quick sketches in the margins.</w:t>
+        <w:t xml:space="preserve">I looked for it. I searched through every sketchbook, page by page, for more than an hour, while he watched me in silence and the coffee went cold in the cups. I searched the backs, the shoulders, the quick sketches in the margins.</w:t>
       </w:r>
     </w:p>
     <w:p>
@@ -8686,7 +8686,7 @@
         <w:pStyle w:val="BodyText"/>
       </w:pPr>
       <w:r>
-        <w:t xml:space="preserve">Then I took my hand away and he pulled the sweater down without a word, and sat down again, and I sat down again, and the two of us looked at the notebooks instead of at each other.</w:t>
+        <w:t xml:space="preserve">Then I took my hand away and he pulled the sweater down without a word, and sat down again, and I sat down again, and the two of us looked at the sketchbooks instead of at each other.</w:t>
       </w:r>
     </w:p>
     <w:p>
@@ -8709,15 +8709,15 @@
         <w:pStyle w:val="FirstParagraph"/>
       </w:pPr>
       <w:r>
-        <w:t xml:space="preserve">I picked up Tuesday’s notebook again. I opened it to the first page, without thinking.</w:t>
-      </w:r>
-    </w:p>
-    <w:p>
-      <w:pPr>
-        <w:pStyle w:val="BodyText"/>
-      </w:pPr>
-      <w:r>
-        <w:t xml:space="preserve">There it was, in my usual handwriting, the same as in every notebook since I was a girl:</w:t>
+        <w:t xml:space="preserve">I picked up Tuesday’s sketchbook again. I opened it to the first page, without thinking.</w:t>
+      </w:r>
+    </w:p>
+    <w:p>
+      <w:pPr>
+        <w:pStyle w:val="BodyText"/>
+      </w:pPr>
+      <w:r>
+        <w:t xml:space="preserve">There it was, in my usual handwriting, the same as in every sketchbook since I was a girl:</w:t>
       </w:r>
     </w:p>
     <w:p>
@@ -8729,7 +8729,7 @@
           <w:iCs/>
           <w:i/>
         </w:rPr>
-        <w:t xml:space="preserve">This notebook belongs to Ada Koch. If you find it, please give it back to me.</w:t>
+        <w:t xml:space="preserve">This sketchbook belongs to Ada Koch. If you find it, please give it back to me.</w:t>
       </w:r>
     </w:p>
     <w:p>
@@ -9034,7 +9034,7 @@
         <w:pStyle w:val="BodyText"/>
       </w:pPr>
       <w:r>
-        <w:t xml:space="preserve">He knew what was in the notebook. A rock. The sea. Clouds, heaps of clouds. My name on the first page.</w:t>
+        <w:t xml:space="preserve">He knew what was in the sketchbook. A rock. The sea. Clouds, heaps of clouds. My name on the first page.</w:t>
       </w:r>
     </w:p>
     <w:p>
@@ -9540,7 +9540,7 @@
         <w:pStyle w:val="BodyText"/>
       </w:pPr>
       <w:r>
-        <w:t xml:space="preserve">I remember putting the notebooks back in the box, one by one, with a care I’d never had before. As if each one were now a house with someone inside.</w:t>
+        <w:t xml:space="preserve">I remember putting the sketchbooks back in the box, one by one, with a care I’d never had before. As if each one were now a house with someone inside.</w:t>
       </w:r>
     </w:p>
     <w:p>
@@ -10621,7 +10621,7 @@
         <w:pStyle w:val="BodyText"/>
       </w:pPr>
       <w:r>
-        <w:t xml:space="preserve">When I sat down again, he was looking at the notebook, closed on the table.</w:t>
+        <w:t xml:space="preserve">When I sat down again, he was looking at the sketchbook, closed on the table.</w:t>
       </w:r>
     </w:p>
     <w:p>
@@ -11747,7 +11747,7 @@
         <w:pStyle w:val="BodyText"/>
       </w:pPr>
       <w:r>
-        <w:t xml:space="preserve">I picked up my bag, the car keys, the list I’d made on the back of an envelope. And then I stopped at the door, looking at the notebook on the kitchen table.</w:t>
+        <w:t xml:space="preserve">I picked up my bag, the car keys, the list I’d made on the back of an envelope. And then I stopped at the door, looking at the sketchbook on the kitchen table.</w:t>
       </w:r>
     </w:p>
     <w:p>
@@ -11763,7 +11763,7 @@
         <w:pStyle w:val="BodyText"/>
       </w:pPr>
       <w:r>
-        <w:t xml:space="preserve">I didn’t know anything about the rules. Whether he could be far from the notebook. Whether the notebook had to be near him, or near me, or near neither of us. If I dropped it in a puddle in the village, what would happen to him?</w:t>
+        <w:t xml:space="preserve">I didn’t know anything about the rules. Whether he could be far from the sketchbook. Whether the sketchbook had to be near him, or near me, or near neither of us. If I dropped it in a puddle in the village, what would happen to him?</w:t>
       </w:r>
     </w:p>
     <w:p>
@@ -12040,7 +12040,7 @@
         <w:pStyle w:val="BodyText"/>
       </w:pPr>
       <w:r>
-        <w:t xml:space="preserve">At every bend I thought the same thing. That I’d open the door and the kitchen would be empty. The fisherman’s sweater folded on the chair. My sweatpants. Nothing else. That I’d open the notebook and the drawing would still be there, on its page, the same as always.</w:t>
+        <w:t xml:space="preserve">At every bend I thought the same thing. That I’d open the door and the kitchen would be empty. The fisherman’s sweater folded on the chair. My sweatpants. Nothing else. That I’d open the sketchbook and the drawing would still be there, on its page, the same as always.</w:t>
       </w:r>
     </w:p>
     <w:p>
@@ -13190,7 +13190,7 @@
         <w:pStyle w:val="BodyText"/>
       </w:pPr>
       <w:r>
-        <w:t xml:space="preserve">He was right. In all my notebooks, on every page, I had always drawn him facing the sea. Sitting on his rock. Standing on a pier. Leaning on a railing. Never in it. Never wet. Never swimming.</w:t>
+        <w:t xml:space="preserve">He was right. In all my sketchbooks, on every page, I had always drawn him facing the sea. Sitting on his rock. Standing on a pier. Leaning on a railing. Never in it. Never wet. Never swimming.</w:t>
       </w:r>
     </w:p>
     <w:p>
@@ -15104,7 +15104,7 @@
         <w:pStyle w:val="BodyText"/>
       </w:pPr>
       <w:r>
-        <w:t xml:space="preserve">I came down even faster. I went straight to the table. The notebook.</w:t>
+        <w:t xml:space="preserve">I came down even faster. I went straight to the table. The sketchbook.</w:t>
       </w:r>
     </w:p>
     <w:p>
@@ -16722,7 +16722,7 @@
         <w:pStyle w:val="BodyText"/>
       </w:pPr>
       <w:r>
-        <w:t xml:space="preserve">I was at the kitchen table with the notebook open. Pretending to draw clouds.</w:t>
+        <w:t xml:space="preserve">I was at the kitchen table with the sketchbook open. Pretending to draw clouds.</w:t>
       </w:r>
     </w:p>
     <w:p>
@@ -16865,7 +16865,7 @@
         <w:pStyle w:val="BodyText"/>
       </w:pPr>
       <w:r>
-        <w:t xml:space="preserve">He turned toward me. He saw the pencil in my hand. The open notebook.</w:t>
+        <w:t xml:space="preserve">He turned toward me. He saw the pencil in my hand. The open sketchbook.</w:t>
       </w:r>
     </w:p>
     <w:p>
@@ -17125,7 +17125,7 @@
         <w:t xml:space="preserve">“</w:t>
       </w:r>
       <w:r>
-        <w:t xml:space="preserve">I know that. You can put a smile on me. But you can’t put the wanting to smile in me. That’s not in your notebook.</w:t>
+        <w:t xml:space="preserve">I know that. You can put a smile on me. But you can’t put the wanting to smile in me. That’s not in your sketchbook.</w:t>
       </w:r>
       <w:r>
         <w:t xml:space="preserve">”</w:t>
@@ -17296,7 +17296,7 @@
         <w:pStyle w:val="BodyText"/>
       </w:pPr>
       <w:r>
-        <w:t xml:space="preserve">My face. He didn’t say the notebook. He didn’t say the drawing. He said my face, as if they were the same thing. And they were.</w:t>
+        <w:t xml:space="preserve">My face. He didn’t say the sketchbook. He didn’t say the drawing. He said my face, as if they were the same thing. And they were.</w:t>
       </w:r>
     </w:p>
     <w:p>
@@ -18608,7 +18608,7 @@
         <w:pStyle w:val="BodyText"/>
       </w:pPr>
       <w:r>
-        <w:t xml:space="preserve">It wasn’t in any notebook. That way of looking at the world, of trusting what he saw over what he was told, of giving things names of bread and sheep. It wasn’t mine. It was his.</w:t>
+        <w:t xml:space="preserve">It wasn’t in any sketchbook. That way of looking at the world, of trusting what he saw over what he was told, of giving things names of bread and sheep. It wasn’t mine. It was his.</w:t>
       </w:r>
     </w:p>
     <w:p>
@@ -18702,7 +18702,7 @@
         <w:t xml:space="preserve">“</w:t>
       </w:r>
       <w:r>
-        <w:t xml:space="preserve">Something that isn’t in the notebooks.</w:t>
+        <w:t xml:space="preserve">Something that isn’t in the sketchbooks.</w:t>
       </w:r>
       <w:r>
         <w:t xml:space="preserve">”</w:t>
@@ -18825,7 +18825,7 @@
         <w:pStyle w:val="BodyText"/>
       </w:pPr>
       <w:r>
-        <w:t xml:space="preserve">Iter took a while to answer. Then he reached across the table and laid his hand on the black notebook, which sat closed between us.</w:t>
+        <w:t xml:space="preserve">Iter took a while to answer. Then he reached across the table and laid his hand on the black sketchbook, which sat closed between us.</w:t>
       </w:r>
     </w:p>
     <w:p>
@@ -19211,7 +19211,7 @@
           <w:iCs/>
           <w:i/>
         </w:rPr>
-        <w:t xml:space="preserve">Something of yours that isn’t in the notebooks.</w:t>
+        <w:t xml:space="preserve">Something of yours that isn’t in the sketchbooks.</w:t>
       </w:r>
     </w:p>
     <w:p>
@@ -19319,7 +19319,7 @@
         <w:pStyle w:val="BodyText"/>
       </w:pPr>
       <w:r>
-        <w:t xml:space="preserve">The way I bend over the notebook when I draw him.</w:t>
+        <w:t xml:space="preserve">The way I bend over the sketchbook when I draw him.</w:t>
       </w:r>
     </w:p>
     <w:p>
@@ -21655,7 +21655,7 @@
         <w:pStyle w:val="BodyText"/>
       </w:pPr>
       <w:r>
-        <w:t xml:space="preserve">On the fifth day, in the morning, I found him sitting at the kitchen table with the notebook open in front of him.</w:t>
+        <w:t xml:space="preserve">On the fifth day, in the morning, I found him sitting at the kitchen table with the sketchbook open in front of him.</w:t>
       </w:r>
     </w:p>
     <w:p>
@@ -21686,7 +21686,7 @@
         <w:pStyle w:val="BodyText"/>
       </w:pPr>
       <w:r>
-        <w:t xml:space="preserve">The notebook was open to his page, the one from the Tuesday of the storm. Him standing, his hands in the pockets of the dark jacket. His hair wet. His mouth about to smile.</w:t>
+        <w:t xml:space="preserve">The sketchbook was open to his page, the one from the Tuesday of the storm. Him standing, his hands in the pockets of the dark jacket. His hair wet. His mouth about to smile.</w:t>
       </w:r>
     </w:p>
     <w:p>
@@ -21864,7 +21864,7 @@
         <w:pStyle w:val="BodyText"/>
       </w:pPr>
       <w:r>
-        <w:t xml:space="preserve">He nodded. He closed the notebook. He laid both hands on top of it, flat.</w:t>
+        <w:t xml:space="preserve">He nodded. He closed the sketchbook. He laid both hands on top of it, flat.</w:t>
       </w:r>
     </w:p>
     <w:p>
@@ -22041,7 +22041,7 @@
         <w:t xml:space="preserve"> </w:t>
       </w:r>
       <w:r>
-        <w:t xml:space="preserve">He looked at his hands on the notebook.</w:t>
+        <w:t xml:space="preserve">He looked at his hands on the sketchbook.</w:t>
       </w:r>
       <w:r>
         <w:t xml:space="preserve"> </w:t>
@@ -22235,7 +22235,7 @@
         <w:pStyle w:val="BodyText"/>
       </w:pPr>
       <w:r>
-        <w:t xml:space="preserve">I reached out and slid the notebook from under his hands. He let me. I held it tight against my chest.</w:t>
+        <w:t xml:space="preserve">I reached out and slid the sketchbook from under his hands. He let me. I held it tight against my chest.</w:t>
       </w:r>
     </w:p>
     <w:p>
@@ -22278,7 +22278,7 @@
         <w:pStyle w:val="FirstParagraph"/>
       </w:pPr>
       <w:r>
-        <w:t xml:space="preserve">I took the notebook up to the tower. I put it away in the lighthouse keepers’ iron trunk, the one under the lamp, with the old manuals and the spare wicks nobody uses anymore. I wrapped it in a cloth so it wouldn’t get damp. I closed the padlock.</w:t>
+        <w:t xml:space="preserve">I took the sketchbook up to the tower. I put it away in the lighthouse keepers’ iron trunk, the one under the lamp, with the old manuals and the spare wicks nobody uses anymore. I wrapped it in a cloth so it wouldn’t get damp. I closed the padlock.</w:t>
       </w:r>
     </w:p>
     <w:p>
@@ -22881,7 +22881,7 @@
         <w:pStyle w:val="BodyText"/>
       </w:pPr>
       <w:r>
-        <w:t xml:space="preserve">About Iter going down to the cove without a jacket. About the notebook locked in the iron trunk. About the key, which I wore around my neck on a string, under my sweater, and which I could feel cold against my skin.</w:t>
+        <w:t xml:space="preserve">About Iter going down to the cove without a jacket. About the sketchbook locked in the iron trunk. About the key, which I wore around my neck on a string, under my sweater, and which I could feel cold against my skin.</w:t>
       </w:r>
     </w:p>
     <w:p>
@@ -24350,7 +24350,7 @@
         <w:t xml:space="preserve">“</w:t>
       </w:r>
       <w:r>
-        <w:t xml:space="preserve">I asked you not to draw me. And you don’t draw me. You’ve put the notebook in a trunk with a padlock and you wear the key around your neck.</w:t>
+        <w:t xml:space="preserve">I asked you not to draw me. And you don’t draw me. You’ve put the sketchbook in a trunk with a padlock and you wear the key around your neck.</w:t>
       </w:r>
       <w:r>
         <w:t xml:space="preserve">”</w:t>
@@ -24368,7 +24368,7 @@
         <w:t xml:space="preserve">“</w:t>
       </w:r>
       <w:r>
-        <w:t xml:space="preserve">I’m here, with no notebook, not knowing if tomorrow I’ll still love you. And you won’t even let me know who’s calling you.</w:t>
+        <w:t xml:space="preserve">I’m here, with no sketchbook, not knowing if tomorrow I’ll still love you. And you won’t even let me know who’s calling you.</w:t>
       </w:r>
       <w:r>
         <w:t xml:space="preserve">”</w:t>
@@ -24484,7 +24484,7 @@
         <w:t xml:space="preserve">“</w:t>
       </w:r>
       <w:r>
-        <w:t xml:space="preserve">You’re not real, Iter. You’re a drawing. You’re something I made in a notebook because I was alone. You have no past, you have no name, you have no right to ask me anything.</w:t>
+        <w:t xml:space="preserve">You’re not real, Iter. You’re a drawing. You’re something I made in a sketchbook because I was alone. You have no past, you have no name, you have no right to ask me anything.</w:t>
       </w:r>
       <w:r>
         <w:t xml:space="preserve">”</w:t>
@@ -27623,7 +27623,7 @@
         <w:pStyle w:val="BodyText"/>
       </w:pPr>
       <w:r>
-        <w:t xml:space="preserve">I took the notebook out of its cloth.</w:t>
+        <w:t xml:space="preserve">I took the sketchbook out of its cloth.</w:t>
       </w:r>
     </w:p>
     <w:p>
@@ -27687,7 +27687,7 @@
         <w:pStyle w:val="BodyText"/>
       </w:pPr>
       <w:r>
-        <w:t xml:space="preserve">I opened the notebook to his page. I took the eraser out of the pocket of another man’s sweatpants.</w:t>
+        <w:t xml:space="preserve">I opened the sketchbook to his page. I took the eraser out of the pocket of another man’s sweatpants.</w:t>
       </w:r>
     </w:p>
     <w:p>
@@ -27898,7 +27898,7 @@
         <w:pStyle w:val="BodyText"/>
       </w:pPr>
       <w:r>
-        <w:t xml:space="preserve">I stayed on my knees in front of the open trunk, the notebook in my hands, looking at him.</w:t>
+        <w:t xml:space="preserve">I stayed on my knees in front of the open trunk, the sketchbook in my hands, looking at him.</w:t>
       </w:r>
     </w:p>
     <w:p>
@@ -28139,15 +28139,15 @@
         <w:pStyle w:val="BodyText"/>
       </w:pPr>
       <w:r>
-        <w:t xml:space="preserve">He crossed the gallery. He knelt in front of me, on the other side of the open notebook. He looked at me. He opened his mouth. Nothing.</w:t>
-      </w:r>
-    </w:p>
-    <w:p>
-      <w:pPr>
-        <w:pStyle w:val="BodyText"/>
-      </w:pPr>
-      <w:r>
-        <w:t xml:space="preserve">And then he reached out the hand he had left, the left one, and laid it on mine. The one holding the notebook.</w:t>
+        <w:t xml:space="preserve">He crossed the gallery. He knelt in front of me, on the other side of the open sketchbook. He looked at me. He opened his mouth. Nothing.</w:t>
+      </w:r>
+    </w:p>
+    <w:p>
+      <w:pPr>
+        <w:pStyle w:val="BodyText"/>
+      </w:pPr>
+      <w:r>
+        <w:t xml:space="preserve">And then he reached out the hand he had left, the left one, and laid it on mine. The one holding the sketchbook.</w:t>
       </w:r>
     </w:p>
     <w:p>
@@ -28550,7 +28550,7 @@
         <w:pStyle w:val="BodyText"/>
       </w:pPr>
       <w:r>
-        <w:t xml:space="preserve">He took it from my fingers gently, with the new hand. And he took the notebook from me too. He closed it. He set it on the floor, between the two of us. And he opened it at the end. At the last blank page.</w:t>
+        <w:t xml:space="preserve">He took it from my fingers gently, with the new hand. And he took the sketchbook from me too. He closed it. He set it on the floor, between the two of us. And he opened it at the end. At the last blank page.</w:t>
       </w:r>
     </w:p>
     <w:p>
@@ -28612,7 +28612,7 @@
         <w:pStyle w:val="BodyText"/>
       </w:pPr>
       <w:r>
-        <w:t xml:space="preserve">When he finished, he turned the notebook toward me.</w:t>
+        <w:t xml:space="preserve">When he finished, he turned the sketchbook toward me.</w:t>
       </w:r>
     </w:p>
     <w:p>
@@ -29592,7 +29592,7 @@
         <w:pStyle w:val="BodyText"/>
       </w:pPr>
       <w:r>
-        <w:t xml:space="preserve">I had seen it once. Twenty years ago. In a notebook with black covers that my granddaughter left open on my kitchen table, one summer. A young man her age, drawn in the corner of a page, with dark eyes and a mouth about to smile.</w:t>
+        <w:t xml:space="preserve">I had seen it once. Twenty years ago. In a sketchbook with black covers that my granddaughter left open on my kitchen table, one summer. A young man her age, drawn in the corner of a page, with dark eyes and a mouth about to smile.</w:t>
       </w:r>
     </w:p>
     <w:p>
@@ -30761,7 +30761,7 @@
         <w:t xml:space="preserve">“</w:t>
       </w:r>
       <w:r>
-        <w:t xml:space="preserve">The three things. I don’t know if I love you because of the notebook or because of me. But the other two are mine for sure.</w:t>
+        <w:t xml:space="preserve">The three things. I don’t know if I love you because of the sketchbook or because of me. But the other two are mine for sure.</w:t>
       </w:r>
       <w:r>
         <w:t xml:space="preserve">”</w:t>
@@ -30891,7 +30891,7 @@
         <w:pStyle w:val="BodyText"/>
       </w:pPr>
       <w:r>
-        <w:t xml:space="preserve">She came down with the notebook.</w:t>
+        <w:t xml:space="preserve">She came down with the sketchbook.</w:t>
       </w:r>
     </w:p>
     <w:p>
@@ -30938,7 +30938,7 @@
         <w:t xml:space="preserve">“</w:t>
       </w:r>
       <w:r>
-        <w:t xml:space="preserve">The notebook. It’s yours. I’m not going to touch it. I don’t know what you have to do with it, and I’m not going to tell you. Keep it. Hide it. Burn it, if you want.</w:t>
+        <w:t xml:space="preserve">The sketchbook. It’s yours. I’m not going to touch it. I don’t know what you have to do with it, and I’m not going to tell you. Keep it. Hide it. Burn it, if you want.</w:t>
       </w:r>
       <w:r>
         <w:t xml:space="preserve">”</w:t>
@@ -30995,7 +30995,7 @@
         <w:pStyle w:val="BodyText"/>
       </w:pPr>
       <w:r>
-        <w:t xml:space="preserve">I looked at the notebook. The black covers. The bent corner. Her name on the first page, in her girl’s handwriting.</w:t>
+        <w:t xml:space="preserve">I looked at the sketchbook. The black covers. The bent corner. Her name on the first page, in her girl’s handwriting.</w:t>
       </w:r>
     </w:p>
     <w:p>
@@ -31011,7 +31011,7 @@
         <w:pStyle w:val="BodyText"/>
       </w:pPr>
       <w:r>
-        <w:t xml:space="preserve">I don’t know if I understood it then. I think I understand it now, while I tell it. That she wasn’t giving me a notebook. She was giving me the pencil. She was giving me the only thing that made her stronger than me.</w:t>
+        <w:t xml:space="preserve">I don’t know if I understood it then. I think I understand it now, while I tell it. That she wasn’t giving me a sketchbook. She was giving me the pencil. She was giving me the only thing that made her stronger than me.</w:t>
       </w:r>
     </w:p>
     <w:p>
@@ -31631,7 +31631,7 @@
         <w:pStyle w:val="BodyText"/>
       </w:pPr>
       <w:r>
-        <w:t xml:space="preserve">He took his jacket from the coat rack. He put it on. He touched his chest, on the inside, where he’d been carrying the notebook for three days. I didn’t know he carried it there. I knew it at that moment, from the gesture.</w:t>
+        <w:t xml:space="preserve">He took his jacket from the coat rack. He put it on. He touched his chest, on the inside, where he’d been carrying the sketchbook for three days. I didn’t know he carried it there. I knew it at that moment, from the gesture.</w:t>
       </w:r>
     </w:p>
     <w:p>
@@ -33193,7 +33193,7 @@
         <w:pStyle w:val="BodyText"/>
       </w:pPr>
       <w:r>
-        <w:t xml:space="preserve">And the notebook fell out of my jacket.</w:t>
+        <w:t xml:space="preserve">And the sketchbook fell out of my jacket.</w:t>
       </w:r>
     </w:p>
     <w:p>
@@ -33248,7 +33248,7 @@
         <w:pStyle w:val="BodyText"/>
       </w:pPr>
       <w:r>
-        <w:t xml:space="preserve">He looked at the notebook again.</w:t>
+        <w:t xml:space="preserve">He looked at the sketchbook again.</w:t>
       </w:r>
     </w:p>
     <w:p>
@@ -33317,7 +33317,7 @@
         <w:t xml:space="preserve">“</w:t>
       </w:r>
       <w:r>
-        <w:t xml:space="preserve">Give me the notebook,</w:t>
+        <w:t xml:space="preserve">Give me the sketchbook,</w:t>
       </w:r>
       <w:r>
         <w:t xml:space="preserve">”</w:t>
@@ -33388,7 +33388,7 @@
         <w:pStyle w:val="BodyText"/>
       </w:pPr>
       <w:r>
-        <w:t xml:space="preserve">And he turned around and went out the open door, into the wind, with the notebook in his hand.</w:t>
+        <w:t xml:space="preserve">And he turned around and went out the open door, into the wind, with the sketchbook in his hand.</w:t>
       </w:r>
     </w:p>
     <w:p>
@@ -33427,7 +33427,7 @@
         <w:pStyle w:val="BodyText"/>
       </w:pPr>
       <w:r>
-        <w:t xml:space="preserve">He was holding the notebook up high. The pages were flapping like a trapped bird.</w:t>
+        <w:t xml:space="preserve">He was holding the sketchbook up high. The pages were flapping like a trapped bird.</w:t>
       </w:r>
     </w:p>
     <w:p>
@@ -33758,7 +33758,7 @@
         <w:pStyle w:val="BodyText"/>
       </w:pPr>
       <w:r>
-        <w:t xml:space="preserve">Ada was on her knees beside me, with her hands on mine, unable to hold them. He looked at her. It wasn’t the look from the kitchen, or from the harbor, or any of the ones I had seen on him. It was the look of a child who has gotten lost in a train station and has just understood that nobody is coming to find him. He looked at her the way you look at a stranger. He knew she drew: three years calling it little drawings. What he didn’t know was who. That since she was a girl, in the margins of all her notebooks, another man had been waiting for her. And that next to him she had stopped drawing him. He had never known her.</w:t>
+        <w:t xml:space="preserve">Ada was on her knees beside me, with her hands on mine, unable to hold them. He looked at her. It wasn’t the look from the kitchen, or from the harbor, or any of the ones I had seen on him. It was the look of a child who has gotten lost in a train station and has just understood that nobody is coming to find him. He looked at her the way you look at a stranger. He knew she drew: three years calling it little drawings. What he didn’t know was who. That since she was a girl, in the margins of all her sketchbooks, another man had been waiting for her. And that next to him she had stopped drawing him. He had never known her.</w:t>
       </w:r>
     </w:p>
     <w:p>
@@ -34085,15 +34085,15 @@
         <w:pStyle w:val="BodyText"/>
       </w:pPr>
       <w:r>
-        <w:t xml:space="preserve">The notebook.</w:t>
-      </w:r>
-    </w:p>
-    <w:p>
-      <w:pPr>
-        <w:pStyle w:val="BodyText"/>
-      </w:pPr>
-      <w:r>
-        <w:t xml:space="preserve">Where was the notebook.</w:t>
+        <w:t xml:space="preserve">The sketchbook.</w:t>
+      </w:r>
+    </w:p>
+    <w:p>
+      <w:pPr>
+        <w:pStyle w:val="BodyText"/>
+      </w:pPr>
+      <w:r>
+        <w:t xml:space="preserve">Where was the sketchbook.</w:t>
       </w:r>
     </w:p>
     <w:p>
@@ -34164,7 +34164,7 @@
         <w:pStyle w:val="BodyText"/>
       </w:pPr>
       <w:r>
-        <w:t xml:space="preserve">It didn’t knock me down. It lifted me. Like a giant hand grabbing me by the waist and lifting me off the ground. I hugged the notebook to my chest with both arms and let it carry me, because letting go wasn’t an option.</w:t>
+        <w:t xml:space="preserve">It didn’t knock me down. It lifted me. Like a giant hand grabbing me by the waist and lifting me off the ground. I hugged the sketchbook to my chest with both arms and let it carry me, because letting go wasn’t an option.</w:t>
       </w:r>
     </w:p>
     <w:p>
@@ -34203,7 +34203,7 @@
         <w:pStyle w:val="BodyText"/>
       </w:pPr>
       <w:r>
-        <w:t xml:space="preserve">It’s strange to say. I remember every second and I don’t remember being afraid. I remember the cold, which wasn’t cold but a blow. I remember the notebook against my chest, wet, soft, like a bird. I remember thinking with total clarity: if I let go, it’s gone. If I let go, he’s gone.</w:t>
+        <w:t xml:space="preserve">It’s strange to say. I remember every second and I don’t remember being afraid. I remember the cold, which wasn’t cold but a blow. I remember the sketchbook against my chest, wet, soft, like a bird. I remember thinking with total clarity: if I let go, it’s gone. If I let go, he’s gone.</w:t>
       </w:r>
     </w:p>
     <w:p>
@@ -34351,7 +34351,7 @@
         <w:t xml:space="preserve">“</w:t>
       </w:r>
       <w:r>
-        <w:t xml:space="preserve">The notebook. Let go of it. Hold on.</w:t>
+        <w:t xml:space="preserve">The sketchbook. Let go of it. Hold on.</w:t>
       </w:r>
       <w:r>
         <w:t xml:space="preserve">”</w:t>
@@ -34479,7 +34479,7 @@
         <w:pStyle w:val="BodyText"/>
       </w:pPr>
       <w:r>
-        <w:t xml:space="preserve">I don’t know how we got there. I know it wasn’t by swimming. It was pushing, pulling, swallowing the sea, with one wave that helped us and another that nearly killed us. I know I smashed my hip against the stone and it didn’t hurt. I know I grabbed the step with one hand and with the other I was still clutching the notebook.</w:t>
+        <w:t xml:space="preserve">I don’t know how we got there. I know it wasn’t by swimming. It was pushing, pulling, swallowing the sea, with one wave that helped us and another that nearly killed us. I know I smashed my hip against the stone and it didn’t hurt. I know I grabbed the step with one hand and with the other I was still clutching the sketchbook.</w:t>
       </w:r>
     </w:p>
     <w:p>
@@ -34726,7 +34726,7 @@
         <w:pStyle w:val="BodyText"/>
       </w:pPr>
       <w:r>
-        <w:t xml:space="preserve">I knelt beside him, soaked, shaking, my knees bleeding, the notebook in my hands.</w:t>
+        <w:t xml:space="preserve">I knelt beside him, soaked, shaking, my knees bleeding, the sketchbook in my hands.</w:t>
       </w:r>
     </w:p>
     <w:p>
@@ -35021,7 +35021,7 @@
         <w:pStyle w:val="BodyText"/>
       </w:pPr>
       <w:r>
-        <w:t xml:space="preserve">All I had were my eyes. Not much. Just enough to see her kneeling beside me with the ruined notebook in her hands, her eyes searching the kitchen for something, desperate.</w:t>
+        <w:t xml:space="preserve">All I had were my eyes. Not much. Just enough to see her kneeling beside me with the ruined sketchbook in her hands, her eyes searching the kitchen for something, desperate.</w:t>
       </w:r>
     </w:p>
     <w:p>
@@ -35164,7 +35164,7 @@
         <w:pStyle w:val="FirstParagraph"/>
       </w:pPr>
       <w:r>
-        <w:t xml:space="preserve">She didn’t draw in the notebook. The notebook was pulp.</w:t>
+        <w:t xml:space="preserve">She didn’t draw in the sketchbook. The sketchbook was pulp.</w:t>
       </w:r>
     </w:p>
     <w:p>
@@ -35504,7 +35504,7 @@
         <w:pStyle w:val="BodyText"/>
       </w:pPr>
       <w:r>
-        <w:t xml:space="preserve">I don’t know what I wanted to say to her. Many things. That I had been afraid in the sea. That she had gone into the water for me with a notebook against her chest, in a heavy swell, the way I went in for her the day of the rocks. That the other one had watched me come apart and had left when she told him to, and that I was glad. That I loved her. That I think I loved her with a part that isn’t on any paper.</w:t>
+        <w:t xml:space="preserve">I don’t know what I wanted to say to her. Many things. That I had been afraid in the sea. That she had gone into the water for me with a sketchbook against her chest, in a heavy swell, the way I went in for her the day of the rocks. That the other one had watched me come apart and had left when she told him to, and that I was glad. That I loved her. That I think I loved her with a part that isn’t on any paper.</w:t>
       </w:r>
     </w:p>
     <w:p>
@@ -36526,7 +36526,7 @@
         <w:pStyle w:val="BodyText"/>
       </w:pPr>
       <w:r>
-        <w:t xml:space="preserve">Inside there were pages. Loose pages, crumpled, soaked, stained with salt and seaweed. Seventeen. I counted them later. Pages from the notebook that the wind had torn out and the sea had left among the stones with the tide.</w:t>
+        <w:t xml:space="preserve">Inside there were pages. Loose pages, crumpled, soaked, stained with salt and seaweed. Seventeen. I counted them later. Pages from the sketchbook that the wind had torn out and the sea had left among the stones with the tide.</w:t>
       </w:r>
     </w:p>
     <w:p>
@@ -36544,7 +36544,7 @@
           <w:iCs/>
           <w:i/>
         </w:rPr>
-        <w:t xml:space="preserve">This notebook belongs to Ada Koch. If you find it, please give it back to me.</w:t>
+        <w:t xml:space="preserve">This sketchbook belongs to Ada Koch. If you find it, please give it back to me.</w:t>
       </w:r>
     </w:p>
     <w:p>
@@ -37308,7 +37308,7 @@
         <w:pStyle w:val="BodyText"/>
       </w:pPr>
       <w:r>
-        <w:t xml:space="preserve">The post smelled of vending-machine coffee and paper. A young officer, with glasses, sat me down in front of an old computer and read aloud to me what they already had: my grandmother, who had seen the gray car going up the hill; Brais, who had found it stuck by the eucalyptus. Then he asked for mine. I told him. The three knocks. The door. A notebook thrown into the sea from the cliff. He typed it all with two fingers.</w:t>
+        <w:t xml:space="preserve">The post smelled of vending-machine coffee and paper. A young officer, with glasses, sat me down in front of an old computer and read aloud to me what they already had: my grandmother, who had seen the gray car going up the hill; Brais, who had found it stuck by the eucalyptus. Then he asked for mine. I told him. The three knocks. The door. A sketchbook thrown into the sea from the cliff. He typed it all with two fingers.</w:t>
       </w:r>
     </w:p>
     <w:p>
@@ -38432,7 +38432,7 @@
         <w:pStyle w:val="BodyText"/>
       </w:pPr>
       <w:r>
-        <w:t xml:space="preserve">The iron trunk was at the top, in the lantern, under the lamp. The same one where Ada had locked the notebook away with a padlock. It didn’t have a padlock anymore. Inside there were things belonging to the keepers who lived here before her. A cap. A logbook with its covers swollen from the damp. And two manuals, in old-fashioned Spanish, with pen-and-ink drawings:</w:t>
+        <w:t xml:space="preserve">The iron trunk was at the top, in the lantern, under the lamp. The same one where Ada had locked the sketchbook away with a padlock. It didn’t have a padlock anymore. Inside there were things belonging to the keepers who lived here before her. A cap. A logbook with its covers swollen from the damp. And two manuals, in old-fashioned Spanish, with pen-and-ink drawings:</w:t>
       </w:r>
       <w:r>
         <w:t xml:space="preserve"> </w:t>

</xml_diff>